<commit_message>
docs: regroupe toutes les agences dans Consultants (profil d'acteur)
</commit_message>
<xml_diff>
--- a/scripts/Rapport_AVS_Avril_vs_Mai_2026.docx
+++ b/scripts/Rapport_AVS_Avril_vs_Mai_2026.docx
@@ -1409,126 +1409,126 @@
                 <w:sz w:val="21"/>
                 <w:szCs w:val="21"/>
               </w:rPr>
-              <w:t xml:space="preserve">Consultants (IQVIA, AFENET, McKing, APW, ESR…)</w:t>
-            </w:r>
-          </w:p>
-        </w:tc>
-        <w:tc>
-          <w:tcPr>
-            <w:tcBorders>
-              <w:top w:val="single" w:sz="4" w:color="B8B8B8"/>
-              <w:left w:val="single" w:sz="4" w:color="B8B8B8"/>
-              <w:bottom w:val="single" w:sz="4" w:color="B8B8B8"/>
-              <w:right w:val="single" w:sz="4" w:color="B8B8B8"/>
-            </w:tcBorders>
-            <w:shd w:val="clear" w:fill="F2F6FB"/>
-          </w:tcPr>
-          <w:p>
-            <w:pPr>
-              <w:jc w:val="right"/>
-            </w:pPr>
-            <w:r>
-              <w:rPr>
-                <w:color w:val="1A1A1A"/>
-                <w:sz w:val="21"/>
-                <w:szCs w:val="21"/>
-              </w:rPr>
-              <w:t xml:space="preserve">310</w:t>
-            </w:r>
-          </w:p>
-        </w:tc>
-        <w:tc>
-          <w:tcPr>
-            <w:tcBorders>
-              <w:top w:val="single" w:sz="4" w:color="B8B8B8"/>
-              <w:left w:val="single" w:sz="4" w:color="B8B8B8"/>
-              <w:bottom w:val="single" w:sz="4" w:color="B8B8B8"/>
-              <w:right w:val="single" w:sz="4" w:color="B8B8B8"/>
-            </w:tcBorders>
-            <w:shd w:val="clear" w:fill="F2F6FB"/>
-          </w:tcPr>
-          <w:p>
-            <w:pPr>
-              <w:jc w:val="right"/>
-            </w:pPr>
-            <w:r>
-              <w:rPr>
-                <w:color w:val="1A1A1A"/>
-                <w:sz w:val="21"/>
-                <w:szCs w:val="21"/>
-              </w:rPr>
-              <w:t xml:space="preserve">471</w:t>
-            </w:r>
-          </w:p>
-        </w:tc>
-      </w:tr>
-      <w:tr>
-        <w:tc>
-          <w:tcPr>
-            <w:tcBorders>
-              <w:top w:val="single" w:sz="4" w:color="B8B8B8"/>
-              <w:left w:val="single" w:sz="4" w:color="B8B8B8"/>
-              <w:bottom w:val="single" w:sz="4" w:color="B8B8B8"/>
-              <w:right w:val="single" w:sz="4" w:color="B8B8B8"/>
-            </w:tcBorders>
-          </w:tcPr>
-          <w:p>
-            <w:pPr>
-              <w:jc w:val="left"/>
-            </w:pPr>
-            <w:r>
-              <w:rPr>
-                <w:color w:val="1A1A1A"/>
-                <w:sz w:val="21"/>
-                <w:szCs w:val="21"/>
-              </w:rPr>
-              <w:t xml:space="preserve">Autres profils (OMS / UNICEF / CDC / ONG…)</w:t>
-            </w:r>
-          </w:p>
-        </w:tc>
-        <w:tc>
-          <w:tcPr>
-            <w:tcBorders>
-              <w:top w:val="single" w:sz="4" w:color="B8B8B8"/>
-              <w:left w:val="single" w:sz="4" w:color="B8B8B8"/>
-              <w:bottom w:val="single" w:sz="4" w:color="B8B8B8"/>
-              <w:right w:val="single" w:sz="4" w:color="B8B8B8"/>
-            </w:tcBorders>
-          </w:tcPr>
-          <w:p>
-            <w:pPr>
-              <w:jc w:val="right"/>
-            </w:pPr>
-            <w:r>
-              <w:rPr>
-                <w:color w:val="1A1A1A"/>
-                <w:sz w:val="21"/>
-                <w:szCs w:val="21"/>
-              </w:rPr>
-              <w:t xml:space="preserve">1 225</w:t>
-            </w:r>
-          </w:p>
-        </w:tc>
-        <w:tc>
-          <w:tcPr>
-            <w:tcBorders>
-              <w:top w:val="single" w:sz="4" w:color="B8B8B8"/>
-              <w:left w:val="single" w:sz="4" w:color="B8B8B8"/>
-              <w:bottom w:val="single" w:sz="4" w:color="B8B8B8"/>
-              <w:right w:val="single" w:sz="4" w:color="B8B8B8"/>
-            </w:tcBorders>
-          </w:tcPr>
-          <w:p>
-            <w:pPr>
-              <w:jc w:val="right"/>
-            </w:pPr>
-            <w:r>
-              <w:rPr>
-                <w:color w:val="1A1A1A"/>
-                <w:sz w:val="21"/>
-                <w:szCs w:val="21"/>
-              </w:rPr>
-              <w:t xml:space="preserve">1 297</w:t>
+              <w:t xml:space="preserve">Consultants (OMS, UNICEF, CDC, BMGF, IQVIA, AFENET, ONG, Croix-Rouge…)</w:t>
+            </w:r>
+          </w:p>
+        </w:tc>
+        <w:tc>
+          <w:tcPr>
+            <w:tcBorders>
+              <w:top w:val="single" w:sz="4" w:color="B8B8B8"/>
+              <w:left w:val="single" w:sz="4" w:color="B8B8B8"/>
+              <w:bottom w:val="single" w:sz="4" w:color="B8B8B8"/>
+              <w:right w:val="single" w:sz="4" w:color="B8B8B8"/>
+            </w:tcBorders>
+            <w:shd w:val="clear" w:fill="F2F6FB"/>
+          </w:tcPr>
+          <w:p>
+            <w:pPr>
+              <w:jc w:val="right"/>
+            </w:pPr>
+            <w:r>
+              <w:rPr>
+                <w:color w:val="1A1A1A"/>
+                <w:sz w:val="21"/>
+                <w:szCs w:val="21"/>
+              </w:rPr>
+              <w:t xml:space="preserve">1 118</w:t>
+            </w:r>
+          </w:p>
+        </w:tc>
+        <w:tc>
+          <w:tcPr>
+            <w:tcBorders>
+              <w:top w:val="single" w:sz="4" w:color="B8B8B8"/>
+              <w:left w:val="single" w:sz="4" w:color="B8B8B8"/>
+              <w:bottom w:val="single" w:sz="4" w:color="B8B8B8"/>
+              <w:right w:val="single" w:sz="4" w:color="B8B8B8"/>
+            </w:tcBorders>
+            <w:shd w:val="clear" w:fill="F2F6FB"/>
+          </w:tcPr>
+          <w:p>
+            <w:pPr>
+              <w:jc w:val="right"/>
+            </w:pPr>
+            <w:r>
+              <w:rPr>
+                <w:color w:val="1A1A1A"/>
+                <w:sz w:val="21"/>
+                <w:szCs w:val="21"/>
+              </w:rPr>
+              <w:t xml:space="preserve">1 445</w:t>
+            </w:r>
+          </w:p>
+        </w:tc>
+      </w:tr>
+      <w:tr>
+        <w:tc>
+          <w:tcPr>
+            <w:tcBorders>
+              <w:top w:val="single" w:sz="4" w:color="B8B8B8"/>
+              <w:left w:val="single" w:sz="4" w:color="B8B8B8"/>
+              <w:bottom w:val="single" w:sz="4" w:color="B8B8B8"/>
+              <w:right w:val="single" w:sz="4" w:color="B8B8B8"/>
+            </w:tcBorders>
+          </w:tcPr>
+          <w:p>
+            <w:pPr>
+              <w:jc w:val="left"/>
+            </w:pPr>
+            <w:r>
+              <w:rPr>
+                <w:color w:val="1A1A1A"/>
+                <w:sz w:val="21"/>
+                <w:szCs w:val="21"/>
+              </w:rPr>
+              <w:t xml:space="preserve">Autres profils (non précisés / stoppeurs)</w:t>
+            </w:r>
+          </w:p>
+        </w:tc>
+        <w:tc>
+          <w:tcPr>
+            <w:tcBorders>
+              <w:top w:val="single" w:sz="4" w:color="B8B8B8"/>
+              <w:left w:val="single" w:sz="4" w:color="B8B8B8"/>
+              <w:bottom w:val="single" w:sz="4" w:color="B8B8B8"/>
+              <w:right w:val="single" w:sz="4" w:color="B8B8B8"/>
+            </w:tcBorders>
+          </w:tcPr>
+          <w:p>
+            <w:pPr>
+              <w:jc w:val="right"/>
+            </w:pPr>
+            <w:r>
+              <w:rPr>
+                <w:color w:val="1A1A1A"/>
+                <w:sz w:val="21"/>
+                <w:szCs w:val="21"/>
+              </w:rPr>
+              <w:t xml:space="preserve">417</w:t>
+            </w:r>
+          </w:p>
+        </w:tc>
+        <w:tc>
+          <w:tcPr>
+            <w:tcBorders>
+              <w:top w:val="single" w:sz="4" w:color="B8B8B8"/>
+              <w:left w:val="single" w:sz="4" w:color="B8B8B8"/>
+              <w:bottom w:val="single" w:sz="4" w:color="B8B8B8"/>
+              <w:right w:val="single" w:sz="4" w:color="B8B8B8"/>
+            </w:tcBorders>
+          </w:tcPr>
+          <w:p>
+            <w:pPr>
+              <w:jc w:val="right"/>
+            </w:pPr>
+            <w:r>
+              <w:rPr>
+                <w:color w:val="1A1A1A"/>
+                <w:sz w:val="21"/>
+                <w:szCs w:val="21"/>
+              </w:rPr>
+              <w:t xml:space="preserve">323</w:t>
             </w:r>
           </w:p>
         </w:tc>

</xml_diff>

<commit_message>
docs: inclut les stoppeurs (Stopper) dans Consultants
</commit_message>
<xml_diff>
--- a/scripts/Rapport_AVS_Avril_vs_Mai_2026.docx
+++ b/scripts/Rapport_AVS_Avril_vs_Mai_2026.docx
@@ -1409,126 +1409,126 @@
                 <w:sz w:val="21"/>
                 <w:szCs w:val="21"/>
               </w:rPr>
-              <w:t xml:space="preserve">Consultants (OMS, UNICEF, CDC, BMGF, IQVIA, AFENET, ONG, Croix-Rouge…)</w:t>
-            </w:r>
-          </w:p>
-        </w:tc>
-        <w:tc>
-          <w:tcPr>
-            <w:tcBorders>
-              <w:top w:val="single" w:sz="4" w:color="B8B8B8"/>
-              <w:left w:val="single" w:sz="4" w:color="B8B8B8"/>
-              <w:bottom w:val="single" w:sz="4" w:color="B8B8B8"/>
-              <w:right w:val="single" w:sz="4" w:color="B8B8B8"/>
-            </w:tcBorders>
-            <w:shd w:val="clear" w:fill="F2F6FB"/>
-          </w:tcPr>
-          <w:p>
-            <w:pPr>
-              <w:jc w:val="right"/>
-            </w:pPr>
-            <w:r>
-              <w:rPr>
-                <w:color w:val="1A1A1A"/>
-                <w:sz w:val="21"/>
-                <w:szCs w:val="21"/>
-              </w:rPr>
-              <w:t xml:space="preserve">1 118</w:t>
-            </w:r>
-          </w:p>
-        </w:tc>
-        <w:tc>
-          <w:tcPr>
-            <w:tcBorders>
-              <w:top w:val="single" w:sz="4" w:color="B8B8B8"/>
-              <w:left w:val="single" w:sz="4" w:color="B8B8B8"/>
-              <w:bottom w:val="single" w:sz="4" w:color="B8B8B8"/>
-              <w:right w:val="single" w:sz="4" w:color="B8B8B8"/>
-            </w:tcBorders>
-            <w:shd w:val="clear" w:fill="F2F6FB"/>
-          </w:tcPr>
-          <w:p>
-            <w:pPr>
-              <w:jc w:val="right"/>
-            </w:pPr>
-            <w:r>
-              <w:rPr>
-                <w:color w:val="1A1A1A"/>
-                <w:sz w:val="21"/>
-                <w:szCs w:val="21"/>
-              </w:rPr>
-              <w:t xml:space="preserve">1 445</w:t>
-            </w:r>
-          </w:p>
-        </w:tc>
-      </w:tr>
-      <w:tr>
-        <w:tc>
-          <w:tcPr>
-            <w:tcBorders>
-              <w:top w:val="single" w:sz="4" w:color="B8B8B8"/>
-              <w:left w:val="single" w:sz="4" w:color="B8B8B8"/>
-              <w:bottom w:val="single" w:sz="4" w:color="B8B8B8"/>
-              <w:right w:val="single" w:sz="4" w:color="B8B8B8"/>
-            </w:tcBorders>
-          </w:tcPr>
-          <w:p>
-            <w:pPr>
-              <w:jc w:val="left"/>
-            </w:pPr>
-            <w:r>
-              <w:rPr>
-                <w:color w:val="1A1A1A"/>
-                <w:sz w:val="21"/>
-                <w:szCs w:val="21"/>
-              </w:rPr>
-              <w:t xml:space="preserve">Autres profils (non précisés / stoppeurs)</w:t>
-            </w:r>
-          </w:p>
-        </w:tc>
-        <w:tc>
-          <w:tcPr>
-            <w:tcBorders>
-              <w:top w:val="single" w:sz="4" w:color="B8B8B8"/>
-              <w:left w:val="single" w:sz="4" w:color="B8B8B8"/>
-              <w:bottom w:val="single" w:sz="4" w:color="B8B8B8"/>
-              <w:right w:val="single" w:sz="4" w:color="B8B8B8"/>
-            </w:tcBorders>
-          </w:tcPr>
-          <w:p>
-            <w:pPr>
-              <w:jc w:val="right"/>
-            </w:pPr>
-            <w:r>
-              <w:rPr>
-                <w:color w:val="1A1A1A"/>
-                <w:sz w:val="21"/>
-                <w:szCs w:val="21"/>
-              </w:rPr>
-              <w:t xml:space="preserve">417</w:t>
-            </w:r>
-          </w:p>
-        </w:tc>
-        <w:tc>
-          <w:tcPr>
-            <w:tcBorders>
-              <w:top w:val="single" w:sz="4" w:color="B8B8B8"/>
-              <w:left w:val="single" w:sz="4" w:color="B8B8B8"/>
-              <w:bottom w:val="single" w:sz="4" w:color="B8B8B8"/>
-              <w:right w:val="single" w:sz="4" w:color="B8B8B8"/>
-            </w:tcBorders>
-          </w:tcPr>
-          <w:p>
-            <w:pPr>
-              <w:jc w:val="right"/>
-            </w:pPr>
-            <w:r>
-              <w:rPr>
-                <w:color w:val="1A1A1A"/>
-                <w:sz w:val="21"/>
-                <w:szCs w:val="21"/>
-              </w:rPr>
-              <w:t xml:space="preserve">323</w:t>
+              <w:t xml:space="preserve">Consultants (OMS, UNICEF, CDC, BMGF, IQVIA, AFENET, ONG, Croix-Rouge, stoppeurs…)</w:t>
+            </w:r>
+          </w:p>
+        </w:tc>
+        <w:tc>
+          <w:tcPr>
+            <w:tcBorders>
+              <w:top w:val="single" w:sz="4" w:color="B8B8B8"/>
+              <w:left w:val="single" w:sz="4" w:color="B8B8B8"/>
+              <w:bottom w:val="single" w:sz="4" w:color="B8B8B8"/>
+              <w:right w:val="single" w:sz="4" w:color="B8B8B8"/>
+            </w:tcBorders>
+            <w:shd w:val="clear" w:fill="F2F6FB"/>
+          </w:tcPr>
+          <w:p>
+            <w:pPr>
+              <w:jc w:val="right"/>
+            </w:pPr>
+            <w:r>
+              <w:rPr>
+                <w:color w:val="1A1A1A"/>
+                <w:sz w:val="21"/>
+                <w:szCs w:val="21"/>
+              </w:rPr>
+              <w:t xml:space="preserve">1 317</w:t>
+            </w:r>
+          </w:p>
+        </w:tc>
+        <w:tc>
+          <w:tcPr>
+            <w:tcBorders>
+              <w:top w:val="single" w:sz="4" w:color="B8B8B8"/>
+              <w:left w:val="single" w:sz="4" w:color="B8B8B8"/>
+              <w:bottom w:val="single" w:sz="4" w:color="B8B8B8"/>
+              <w:right w:val="single" w:sz="4" w:color="B8B8B8"/>
+            </w:tcBorders>
+            <w:shd w:val="clear" w:fill="F2F6FB"/>
+          </w:tcPr>
+          <w:p>
+            <w:pPr>
+              <w:jc w:val="right"/>
+            </w:pPr>
+            <w:r>
+              <w:rPr>
+                <w:color w:val="1A1A1A"/>
+                <w:sz w:val="21"/>
+                <w:szCs w:val="21"/>
+              </w:rPr>
+              <w:t xml:space="preserve">1 587</w:t>
+            </w:r>
+          </w:p>
+        </w:tc>
+      </w:tr>
+      <w:tr>
+        <w:tc>
+          <w:tcPr>
+            <w:tcBorders>
+              <w:top w:val="single" w:sz="4" w:color="B8B8B8"/>
+              <w:left w:val="single" w:sz="4" w:color="B8B8B8"/>
+              <w:bottom w:val="single" w:sz="4" w:color="B8B8B8"/>
+              <w:right w:val="single" w:sz="4" w:color="B8B8B8"/>
+            </w:tcBorders>
+          </w:tcPr>
+          <w:p>
+            <w:pPr>
+              <w:jc w:val="left"/>
+            </w:pPr>
+            <w:r>
+              <w:rPr>
+                <w:color w:val="1A1A1A"/>
+                <w:sz w:val="21"/>
+                <w:szCs w:val="21"/>
+              </w:rPr>
+              <w:t xml:space="preserve">Autres profils (non précisés)</w:t>
+            </w:r>
+          </w:p>
+        </w:tc>
+        <w:tc>
+          <w:tcPr>
+            <w:tcBorders>
+              <w:top w:val="single" w:sz="4" w:color="B8B8B8"/>
+              <w:left w:val="single" w:sz="4" w:color="B8B8B8"/>
+              <w:bottom w:val="single" w:sz="4" w:color="B8B8B8"/>
+              <w:right w:val="single" w:sz="4" w:color="B8B8B8"/>
+            </w:tcBorders>
+          </w:tcPr>
+          <w:p>
+            <w:pPr>
+              <w:jc w:val="right"/>
+            </w:pPr>
+            <w:r>
+              <w:rPr>
+                <w:color w:val="1A1A1A"/>
+                <w:sz w:val="21"/>
+                <w:szCs w:val="21"/>
+              </w:rPr>
+              <w:t xml:space="preserve">218</w:t>
+            </w:r>
+          </w:p>
+        </w:tc>
+        <w:tc>
+          <w:tcPr>
+            <w:tcBorders>
+              <w:top w:val="single" w:sz="4" w:color="B8B8B8"/>
+              <w:left w:val="single" w:sz="4" w:color="B8B8B8"/>
+              <w:bottom w:val="single" w:sz="4" w:color="B8B8B8"/>
+              <w:right w:val="single" w:sz="4" w:color="B8B8B8"/>
+            </w:tcBorders>
+          </w:tcPr>
+          <w:p>
+            <w:pPr>
+              <w:jc w:val="right"/>
+            </w:pPr>
+            <w:r>
+              <w:rPr>
+                <w:color w:val="1A1A1A"/>
+                <w:sz w:val="21"/>
+                <w:szCs w:val="21"/>
+              </w:rPr>
+              <w:t xml:space="preserve">181</w:t>
             </w:r>
           </w:p>
         </w:tc>

</xml_diff>